<commit_message>
Subida imagenes, y mejora de documento memoria
</commit_message>
<xml_diff>
--- a/docs/Proyecto_RuteX_GO.docx
+++ b/docs/Proyecto_RuteX_GO.docx
@@ -109,9 +109,12 @@
     <w:p>
       <w:pPr>
         <w:sectPr>
-          <w:headerReference w:type="default" r:id="rId9"/>
-          <w:footerReference w:type="default" r:id="rId10"/>
-          <w:headerReference w:type="first" r:id="rId11"/>
+          <w:headerReference w:type="even" r:id="rId9"/>
+          <w:headerReference w:type="default" r:id="rId10"/>
+          <w:footerReference w:type="even" r:id="rId11"/>
+          <w:footerReference w:type="default" r:id="rId12"/>
+          <w:headerReference w:type="first" r:id="rId13"/>
+          <w:footerReference w:type="first" r:id="rId14"/>
           <w:pgSz w:w="11906" w:h="16838"/>
           <w:pgMar w:top="1417" w:right="1701" w:bottom="1417" w:left="1701" w:header="708" w:footer="41" w:gutter="0"/>
           <w:cols w:space="720"/>
@@ -2566,7 +2569,21 @@
         <w:rPr>
           <w:rFonts w:ascii="Arial" w:hAnsi="Arial" w:cs="Arial"/>
         </w:rPr>
-        <w:t xml:space="preserve">/Kotlin, </w:t>
+        <w:t>/</w:t>
+      </w:r>
+      <w:proofErr w:type="spellStart"/>
+      <w:r>
+        <w:rPr>
+          <w:rFonts w:ascii="Arial" w:hAnsi="Arial" w:cs="Arial"/>
+        </w:rPr>
+        <w:t>Kotlin</w:t>
+      </w:r>
+      <w:proofErr w:type="spellEnd"/>
+      <w:r>
+        <w:rPr>
+          <w:rFonts w:ascii="Arial" w:hAnsi="Arial" w:cs="Arial"/>
+        </w:rPr>
+        <w:t xml:space="preserve">, </w:t>
       </w:r>
       <w:r>
         <w:rPr>
@@ -3112,7 +3129,7 @@
                 <w:szCs w:val="20"/>
               </w:rPr>
             </w:pPr>
-            <w:hyperlink r:id="rId12">
+            <w:hyperlink r:id="rId15">
               <w:r>
                 <w:rPr>
                   <w:rStyle w:val="Hipervnculo"/>
@@ -3366,7 +3383,7 @@
                 <w:szCs w:val="20"/>
               </w:rPr>
             </w:pPr>
-            <w:hyperlink r:id="rId13">
+            <w:hyperlink r:id="rId16">
               <w:r>
                 <w:rPr>
                   <w:rStyle w:val="Hipervnculo"/>
@@ -3595,7 +3612,7 @@
                 <w:szCs w:val="20"/>
               </w:rPr>
             </w:pPr>
-            <w:hyperlink r:id="rId14">
+            <w:hyperlink r:id="rId17">
               <w:r>
                 <w:rPr>
                   <w:rStyle w:val="Hipervnculo"/>
@@ -3814,7 +3831,7 @@
                 <w:szCs w:val="20"/>
               </w:rPr>
             </w:pPr>
-            <w:hyperlink r:id="rId15">
+            <w:hyperlink r:id="rId18">
               <w:r>
                 <w:rPr>
                   <w:rStyle w:val="Hipervnculo"/>
@@ -4233,7 +4250,7 @@
                           </pic:cNvPicPr>
                         </pic:nvPicPr>
                         <pic:blipFill>
-                          <a:blip r:embed="rId16">
+                          <a:blip r:embed="rId19">
                             <a:extLst>
                               <a:ext uri="{28A0092B-C50C-407E-A947-70E740481C1C}">
                                 <a14:useLocalDpi xmlns:a14="http://schemas.microsoft.com/office/drawing/2010/main" val="0"/>
@@ -4469,7 +4486,7 @@
                           </pic:cNvPicPr>
                         </pic:nvPicPr>
                         <pic:blipFill>
-                          <a:blip r:embed="rId17" cstate="print">
+                          <a:blip r:embed="rId20" cstate="print">
                             <a:extLst>
                               <a:ext uri="{28A0092B-C50C-407E-A947-70E740481C1C}">
                                 <a14:useLocalDpi xmlns:a14="http://schemas.microsoft.com/office/drawing/2010/main" val="0"/>
@@ -4636,7 +4653,7 @@
                           </pic:cNvPicPr>
                         </pic:nvPicPr>
                         <pic:blipFill>
-                          <a:blip r:embed="rId18">
+                          <a:blip r:embed="rId21">
                             <a:extLst>
                               <a:ext uri="{28A0092B-C50C-407E-A947-70E740481C1C}">
                                 <a14:useLocalDpi xmlns:a14="http://schemas.microsoft.com/office/drawing/2010/main" val="0"/>
@@ -4787,7 +4804,7 @@
                           </pic:cNvPicPr>
                         </pic:nvPicPr>
                         <pic:blipFill>
-                          <a:blip r:embed="rId19">
+                          <a:blip r:embed="rId22">
                             <a:extLst>
                               <a:ext uri="{28A0092B-C50C-407E-A947-70E740481C1C}">
                                 <a14:useLocalDpi xmlns:a14="http://schemas.microsoft.com/office/drawing/2010/main" val="0"/>
@@ -4949,7 +4966,7 @@
                           </pic:cNvPicPr>
                         </pic:nvPicPr>
                         <pic:blipFill>
-                          <a:blip r:embed="rId20" cstate="print">
+                          <a:blip r:embed="rId23" cstate="print">
                             <a:extLst>
                               <a:ext uri="{28A0092B-C50C-407E-A947-70E740481C1C}">
                                 <a14:useLocalDpi xmlns:a14="http://schemas.microsoft.com/office/drawing/2010/main" val="0"/>
@@ -5668,7 +5685,7 @@
                     </pic:cNvPicPr>
                   </pic:nvPicPr>
                   <pic:blipFill>
-                    <a:blip r:embed="rId21">
+                    <a:blip r:embed="rId24">
                       <a:extLst>
                         <a:ext uri="{28A0092B-C50C-407E-A947-70E740481C1C}">
                           <a14:useLocalDpi xmlns:a14="http://schemas.microsoft.com/office/drawing/2010/main" val="0"/>
@@ -5761,7 +5778,7 @@
                     </pic:cNvPicPr>
                   </pic:nvPicPr>
                   <pic:blipFill>
-                    <a:blip r:embed="rId22">
+                    <a:blip r:embed="rId25">
                       <a:extLst>
                         <a:ext uri="{28A0092B-C50C-407E-A947-70E740481C1C}">
                           <a14:useLocalDpi xmlns:a14="http://schemas.microsoft.com/office/drawing/2010/main" val="0"/>
@@ -5919,7 +5936,21 @@
         <w:rPr>
           <w:rFonts w:ascii="Arial" w:hAnsi="Arial" w:cs="Arial"/>
         </w:rPr>
-        <w:t xml:space="preserve">/kotlin como </w:t>
+        <w:t>/</w:t>
+      </w:r>
+      <w:proofErr w:type="spellStart"/>
+      <w:r>
+        <w:rPr>
+          <w:rFonts w:ascii="Arial" w:hAnsi="Arial" w:cs="Arial"/>
+        </w:rPr>
+        <w:t>kotlin</w:t>
+      </w:r>
+      <w:proofErr w:type="spellEnd"/>
+      <w:r>
+        <w:rPr>
+          <w:rFonts w:ascii="Arial" w:hAnsi="Arial" w:cs="Arial"/>
+        </w:rPr>
+        <w:t xml:space="preserve"> como </w:t>
       </w:r>
       <w:proofErr w:type="spellStart"/>
       <w:r>
@@ -6854,12 +6885,12 @@
       </w:r>
     </w:p>
     <w:sectPr>
-      <w:headerReference w:type="even" r:id="rId23"/>
-      <w:headerReference w:type="default" r:id="rId24"/>
-      <w:footerReference w:type="even" r:id="rId25"/>
-      <w:footerReference w:type="default" r:id="rId26"/>
-      <w:headerReference w:type="first" r:id="rId27"/>
-      <w:footerReference w:type="first" r:id="rId28"/>
+      <w:headerReference w:type="even" r:id="rId26"/>
+      <w:headerReference w:type="default" r:id="rId27"/>
+      <w:footerReference w:type="even" r:id="rId28"/>
+      <w:footerReference w:type="default" r:id="rId29"/>
+      <w:headerReference w:type="first" r:id="rId30"/>
+      <w:footerReference w:type="first" r:id="rId31"/>
       <w:pgSz w:w="11906" w:h="16838"/>
       <w:pgMar w:top="1417" w:right="1701" w:bottom="1417" w:left="1701" w:header="708" w:footer="708" w:gutter="0"/>
       <w:pgNumType w:start="1"/>
@@ -6897,6 +6928,16 @@
 </file>
 
 <file path=word/footer1.xml><?xml version="1.0" encoding="utf-8"?>
+<w:ftr xmlns:wpc="http://schemas.microsoft.com/office/word/2010/wordprocessingCanvas" xmlns:cx="http://schemas.microsoft.com/office/drawing/2014/chartex" xmlns:cx1="http://schemas.microsoft.com/office/drawing/2015/9/8/chartex" xmlns:cx2="http://schemas.microsoft.com/office/drawing/2015/10/21/chartex" xmlns:cx3="http://schemas.microsoft.com/office/drawing/2016/5/9/chartex" xmlns:cx4="http://schemas.microsoft.com/office/drawing/2016/5/10/chartex" xmlns:cx5="http://schemas.microsoft.com/office/drawing/2016/5/11/chartex" xmlns:cx6="http://schemas.microsoft.com/office/drawing/2016/5/12/chartex" xmlns:cx7="http://schemas.microsoft.com/office/drawing/2016/5/13/chartex" xmlns:cx8="http://schemas.microsoft.com/office/drawing/2016/5/14/chartex" xmlns:mc="http://schemas.openxmlformats.org/markup-compatibility/2006" xmlns:aink="http://schemas.microsoft.com/office/drawing/2016/ink" xmlns:am3d="http://schemas.microsoft.com/office/drawing/2017/model3d" xmlns:o="urn:schemas-microsoft-com:office:office" xmlns:oel="http://schemas.microsoft.com/office/2019/extlst" xmlns:r="http://schemas.openxmlformats.org/officeDocument/2006/relationships" xmlns:m="http://schemas.openxmlformats.org/officeDocument/2006/math" xmlns:v="urn:schemas-microsoft-com:vml" xmlns:wp14="http://schemas.microsoft.com/office/word/2010/wordprocessingDrawing" xmlns:wp="http://schemas.openxmlformats.org/drawingml/2006/wordprocessingDrawing" xmlns:w10="urn:schemas-microsoft-com:office:word" xmlns:w="http://schemas.openxmlformats.org/wordprocessingml/2006/main" xmlns:w14="http://schemas.microsoft.com/office/word/2010/wordml" xmlns:w15="http://schemas.microsoft.com/office/word/2012/wordml" xmlns:w16cex="http://schemas.microsoft.com/office/word/2018/wordml/cex" xmlns:w16cid="http://schemas.microsoft.com/office/word/2016/wordml/cid" xmlns:w16="http://schemas.microsoft.com/office/word/2018/wordml" xmlns:w16du="http://schemas.microsoft.com/office/word/2023/wordml/word16du" xmlns:w16sdtdh="http://schemas.microsoft.com/office/word/2020/wordml/sdtdatahash" xmlns:w16sdtfl="http://schemas.microsoft.com/office/word/2024/wordml/sdtformatlock" xmlns:w16se="http://schemas.microsoft.com/office/word/2015/wordml/symex" xmlns:wpg="http://schemas.microsoft.com/office/word/2010/wordprocessingGroup" xmlns:wpi="http://schemas.microsoft.com/office/word/2010/wordprocessingInk" xmlns:wne="http://schemas.microsoft.com/office/word/2006/wordml" xmlns:wps="http://schemas.microsoft.com/office/word/2010/wordprocessingShape" mc:Ignorable="w14 w15 w16se w16cid w16 w16cex w16sdtdh w16sdtfl w16du wp14">
+  <w:p>
+    <w:pPr>
+      <w:pStyle w:val="Piedepgina"/>
+    </w:pPr>
+  </w:p>
+</w:ftr>
+</file>
+
+<file path=word/footer2.xml><?xml version="1.0" encoding="utf-8"?>
 <w:ftr xmlns:wpc="http://schemas.microsoft.com/office/word/2010/wordprocessingCanvas" xmlns:cx="http://schemas.microsoft.com/office/drawing/2014/chartex" xmlns:cx1="http://schemas.microsoft.com/office/drawing/2015/9/8/chartex" xmlns:cx2="http://schemas.microsoft.com/office/drawing/2015/10/21/chartex" xmlns:cx3="http://schemas.microsoft.com/office/drawing/2016/5/9/chartex" xmlns:cx4="http://schemas.microsoft.com/office/drawing/2016/5/10/chartex" xmlns:cx5="http://schemas.microsoft.com/office/drawing/2016/5/11/chartex" xmlns:cx6="http://schemas.microsoft.com/office/drawing/2016/5/12/chartex" xmlns:cx7="http://schemas.microsoft.com/office/drawing/2016/5/13/chartex" xmlns:cx8="http://schemas.microsoft.com/office/drawing/2016/5/14/chartex" xmlns:mc="http://schemas.openxmlformats.org/markup-compatibility/2006" xmlns:aink="http://schemas.microsoft.com/office/drawing/2016/ink" xmlns:am3d="http://schemas.microsoft.com/office/drawing/2017/model3d" xmlns:o="urn:schemas-microsoft-com:office:office" xmlns:oel="http://schemas.microsoft.com/office/2019/extlst" xmlns:r="http://schemas.openxmlformats.org/officeDocument/2006/relationships" xmlns:m="http://schemas.openxmlformats.org/officeDocument/2006/math" xmlns:v="urn:schemas-microsoft-com:vml" xmlns:wp14="http://schemas.microsoft.com/office/word/2010/wordprocessingDrawing" xmlns:wp="http://schemas.openxmlformats.org/drawingml/2006/wordprocessingDrawing" xmlns:w10="urn:schemas-microsoft-com:office:word" xmlns:w="http://schemas.openxmlformats.org/wordprocessingml/2006/main" xmlns:w14="http://schemas.microsoft.com/office/word/2010/wordml" xmlns:w15="http://schemas.microsoft.com/office/word/2012/wordml" xmlns:w16cex="http://schemas.microsoft.com/office/word/2018/wordml/cex" xmlns:w16cid="http://schemas.microsoft.com/office/word/2016/wordml/cid" xmlns:w16="http://schemas.microsoft.com/office/word/2018/wordml" xmlns:w16du="http://schemas.microsoft.com/office/word/2023/wordml/word16du" xmlns:w16sdtdh="http://schemas.microsoft.com/office/word/2020/wordml/sdtdatahash" xmlns:w16sdtfl="http://schemas.microsoft.com/office/word/2024/wordml/sdtformatlock" xmlns:w16se="http://schemas.microsoft.com/office/word/2015/wordml/symex" xmlns:wpg="http://schemas.microsoft.com/office/word/2010/wordprocessingGroup" xmlns:wpi="http://schemas.microsoft.com/office/word/2010/wordprocessingInk" xmlns:wne="http://schemas.microsoft.com/office/word/2006/wordml" xmlns:wps="http://schemas.microsoft.com/office/word/2010/wordprocessingShape" mc:Ignorable="w14 w15 w16se w16cid w16 w16cex w16sdtdh w16sdtfl w16du wp14">
   <w:tbl>
     <w:tblPr>
@@ -7087,7 +7128,7 @@
 </w:ftr>
 </file>
 
-<file path=word/footer2.xml><?xml version="1.0" encoding="utf-8"?>
+<file path=word/footer3.xml><?xml version="1.0" encoding="utf-8"?>
 <w:ftr xmlns:wpc="http://schemas.microsoft.com/office/word/2010/wordprocessingCanvas" xmlns:cx="http://schemas.microsoft.com/office/drawing/2014/chartex" xmlns:cx1="http://schemas.microsoft.com/office/drawing/2015/9/8/chartex" xmlns:cx2="http://schemas.microsoft.com/office/drawing/2015/10/21/chartex" xmlns:cx3="http://schemas.microsoft.com/office/drawing/2016/5/9/chartex" xmlns:cx4="http://schemas.microsoft.com/office/drawing/2016/5/10/chartex" xmlns:cx5="http://schemas.microsoft.com/office/drawing/2016/5/11/chartex" xmlns:cx6="http://schemas.microsoft.com/office/drawing/2016/5/12/chartex" xmlns:cx7="http://schemas.microsoft.com/office/drawing/2016/5/13/chartex" xmlns:cx8="http://schemas.microsoft.com/office/drawing/2016/5/14/chartex" xmlns:mc="http://schemas.openxmlformats.org/markup-compatibility/2006" xmlns:aink="http://schemas.microsoft.com/office/drawing/2016/ink" xmlns:am3d="http://schemas.microsoft.com/office/drawing/2017/model3d" xmlns:o="urn:schemas-microsoft-com:office:office" xmlns:oel="http://schemas.microsoft.com/office/2019/extlst" xmlns:r="http://schemas.openxmlformats.org/officeDocument/2006/relationships" xmlns:m="http://schemas.openxmlformats.org/officeDocument/2006/math" xmlns:v="urn:schemas-microsoft-com:vml" xmlns:wp14="http://schemas.microsoft.com/office/word/2010/wordprocessingDrawing" xmlns:wp="http://schemas.openxmlformats.org/drawingml/2006/wordprocessingDrawing" xmlns:w10="urn:schemas-microsoft-com:office:word" xmlns:w="http://schemas.openxmlformats.org/wordprocessingml/2006/main" xmlns:w14="http://schemas.microsoft.com/office/word/2010/wordml" xmlns:w15="http://schemas.microsoft.com/office/word/2012/wordml" xmlns:w16cex="http://schemas.microsoft.com/office/word/2018/wordml/cex" xmlns:w16cid="http://schemas.microsoft.com/office/word/2016/wordml/cid" xmlns:w16="http://schemas.microsoft.com/office/word/2018/wordml" xmlns:w16du="http://schemas.microsoft.com/office/word/2023/wordml/word16du" xmlns:w16sdtdh="http://schemas.microsoft.com/office/word/2020/wordml/sdtdatahash" xmlns:w16sdtfl="http://schemas.microsoft.com/office/word/2024/wordml/sdtformatlock" xmlns:w16se="http://schemas.microsoft.com/office/word/2015/wordml/symex" xmlns:wpg="http://schemas.microsoft.com/office/word/2010/wordprocessingGroup" xmlns:wpi="http://schemas.microsoft.com/office/word/2010/wordprocessingInk" xmlns:wne="http://schemas.microsoft.com/office/word/2006/wordml" xmlns:wps="http://schemas.microsoft.com/office/word/2010/wordprocessingShape" mc:Ignorable="w14 w15 w16se w16cid w16 w16cex w16sdtdh w16sdtfl w16du wp14">
   <w:p>
     <w:pPr>
@@ -7097,36 +7138,51 @@
 </w:ftr>
 </file>
 
-<file path=word/footer3.xml><?xml version="1.0" encoding="utf-8"?>
+<file path=word/footer4.xml><?xml version="1.0" encoding="utf-8"?>
 <w:ftr xmlns:wpc="http://schemas.microsoft.com/office/word/2010/wordprocessingCanvas" xmlns:cx="http://schemas.microsoft.com/office/drawing/2014/chartex" xmlns:cx1="http://schemas.microsoft.com/office/drawing/2015/9/8/chartex" xmlns:cx2="http://schemas.microsoft.com/office/drawing/2015/10/21/chartex" xmlns:cx3="http://schemas.microsoft.com/office/drawing/2016/5/9/chartex" xmlns:cx4="http://schemas.microsoft.com/office/drawing/2016/5/10/chartex" xmlns:cx5="http://schemas.microsoft.com/office/drawing/2016/5/11/chartex" xmlns:cx6="http://schemas.microsoft.com/office/drawing/2016/5/12/chartex" xmlns:cx7="http://schemas.microsoft.com/office/drawing/2016/5/13/chartex" xmlns:cx8="http://schemas.microsoft.com/office/drawing/2016/5/14/chartex" xmlns:mc="http://schemas.openxmlformats.org/markup-compatibility/2006" xmlns:aink="http://schemas.microsoft.com/office/drawing/2016/ink" xmlns:am3d="http://schemas.microsoft.com/office/drawing/2017/model3d" xmlns:o="urn:schemas-microsoft-com:office:office" xmlns:oel="http://schemas.microsoft.com/office/2019/extlst" xmlns:r="http://schemas.openxmlformats.org/officeDocument/2006/relationships" xmlns:m="http://schemas.openxmlformats.org/officeDocument/2006/math" xmlns:v="urn:schemas-microsoft-com:vml" xmlns:wp14="http://schemas.microsoft.com/office/word/2010/wordprocessingDrawing" xmlns:wp="http://schemas.openxmlformats.org/drawingml/2006/wordprocessingDrawing" xmlns:w10="urn:schemas-microsoft-com:office:word" xmlns:w="http://schemas.openxmlformats.org/wordprocessingml/2006/main" xmlns:w14="http://schemas.microsoft.com/office/word/2010/wordml" xmlns:w15="http://schemas.microsoft.com/office/word/2012/wordml" xmlns:w16cex="http://schemas.microsoft.com/office/word/2018/wordml/cex" xmlns:w16cid="http://schemas.microsoft.com/office/word/2016/wordml/cid" xmlns:w16="http://schemas.microsoft.com/office/word/2018/wordml" xmlns:w16du="http://schemas.microsoft.com/office/word/2023/wordml/word16du" xmlns:w16sdtdh="http://schemas.microsoft.com/office/word/2020/wordml/sdtdatahash" xmlns:w16sdtfl="http://schemas.microsoft.com/office/word/2024/wordml/sdtformatlock" xmlns:w16se="http://schemas.microsoft.com/office/word/2015/wordml/symex" xmlns:wpg="http://schemas.microsoft.com/office/word/2010/wordprocessingGroup" xmlns:wpi="http://schemas.microsoft.com/office/word/2010/wordprocessingInk" xmlns:wne="http://schemas.microsoft.com/office/word/2006/wordml" xmlns:wps="http://schemas.microsoft.com/office/word/2010/wordprocessingShape" mc:Ignorable="w14 w15 w16se w16cid w16 w16cex w16sdtdh w16sdtfl w16du wp14">
-  <w:sdt>
-    <w:sdtPr>
-      <w:id w:val="982278997"/>
-      <w:docPartObj>
-        <w:docPartGallery w:val="Page Numbers (Bottom of Page)"/>
-        <w:docPartUnique/>
-      </w:docPartObj>
-    </w:sdtPr>
-    <w:sdtContent>
-      <w:p>
-        <w:pPr>
-          <w:pStyle w:val="Piedepgina"/>
-          <w:jc w:val="center"/>
-        </w:pPr>
+  <w:p>
+    <w:pPr>
+      <w:pStyle w:val="Piedepgina"/>
+    </w:pPr>
+  </w:p>
+</w:ftr>
+</file>
+
+<file path=word/footer5.xml><?xml version="1.0" encoding="utf-8"?>
+<w:ftr xmlns:wpc="http://schemas.microsoft.com/office/word/2010/wordprocessingCanvas" xmlns:cx="http://schemas.microsoft.com/office/drawing/2014/chartex" xmlns:cx1="http://schemas.microsoft.com/office/drawing/2015/9/8/chartex" xmlns:cx2="http://schemas.microsoft.com/office/drawing/2015/10/21/chartex" xmlns:cx3="http://schemas.microsoft.com/office/drawing/2016/5/9/chartex" xmlns:cx4="http://schemas.microsoft.com/office/drawing/2016/5/10/chartex" xmlns:cx5="http://schemas.microsoft.com/office/drawing/2016/5/11/chartex" xmlns:cx6="http://schemas.microsoft.com/office/drawing/2016/5/12/chartex" xmlns:cx7="http://schemas.microsoft.com/office/drawing/2016/5/13/chartex" xmlns:cx8="http://schemas.microsoft.com/office/drawing/2016/5/14/chartex" xmlns:mc="http://schemas.openxmlformats.org/markup-compatibility/2006" xmlns:aink="http://schemas.microsoft.com/office/drawing/2016/ink" xmlns:am3d="http://schemas.microsoft.com/office/drawing/2017/model3d" xmlns:o="urn:schemas-microsoft-com:office:office" xmlns:oel="http://schemas.microsoft.com/office/2019/extlst" xmlns:r="http://schemas.openxmlformats.org/officeDocument/2006/relationships" xmlns:m="http://schemas.openxmlformats.org/officeDocument/2006/math" xmlns:v="urn:schemas-microsoft-com:vml" xmlns:wp14="http://schemas.microsoft.com/office/word/2010/wordprocessingDrawing" xmlns:wp="http://schemas.openxmlformats.org/drawingml/2006/wordprocessingDrawing" xmlns:w10="urn:schemas-microsoft-com:office:word" xmlns:w="http://schemas.openxmlformats.org/wordprocessingml/2006/main" xmlns:w14="http://schemas.microsoft.com/office/word/2010/wordml" xmlns:w15="http://schemas.microsoft.com/office/word/2012/wordml" xmlns:w16cex="http://schemas.microsoft.com/office/word/2018/wordml/cex" xmlns:w16cid="http://schemas.microsoft.com/office/word/2016/wordml/cid" xmlns:w16="http://schemas.microsoft.com/office/word/2018/wordml" xmlns:w16du="http://schemas.microsoft.com/office/word/2023/wordml/word16du" xmlns:w16sdtdh="http://schemas.microsoft.com/office/word/2020/wordml/sdtdatahash" xmlns:w16sdtfl="http://schemas.microsoft.com/office/word/2024/wordml/sdtformatlock" xmlns:w16se="http://schemas.microsoft.com/office/word/2015/wordml/symex" xmlns:wpg="http://schemas.microsoft.com/office/word/2010/wordprocessingGroup" xmlns:wpi="http://schemas.microsoft.com/office/word/2010/wordprocessingInk" xmlns:wne="http://schemas.microsoft.com/office/word/2006/wordml" xmlns:wps="http://schemas.microsoft.com/office/word/2010/wordprocessingShape" mc:Ignorable="w14 w15 w16se w16cid w16 w16cex w16sdtdh w16sdtfl w16du wp14">
+  <w:p>
+    <w:pPr>
+      <w:pStyle w:val="Piedepgina"/>
+      <w:tabs>
+        <w:tab w:val="left" w:pos="5949"/>
+      </w:tabs>
+    </w:pPr>
+    <w:r>
+      <w:tab/>
+    </w:r>
+    <w:sdt>
+      <w:sdtPr>
+        <w:id w:val="982278997"/>
+        <w:docPartObj>
+          <w:docPartGallery w:val="Page Numbers (Bottom of Page)"/>
+          <w:docPartUnique/>
+        </w:docPartObj>
+      </w:sdtPr>
+      <w:sdtContent>
         <w:r>
           <w:rPr>
             <w:noProof/>
           </w:rPr>
           <w:drawing>
-            <wp:anchor distT="0" distB="0" distL="0" distR="0" simplePos="0" relativeHeight="251653120" behindDoc="1" locked="0" layoutInCell="1" allowOverlap="1" wp14:anchorId="53353427" wp14:editId="3B1EB028">
+            <wp:anchor distT="0" distB="0" distL="0" distR="0" simplePos="0" relativeHeight="251653120" behindDoc="1" locked="0" layoutInCell="1" allowOverlap="1" wp14:anchorId="53353427" wp14:editId="418F45D3">
               <wp:simplePos x="0" y="0"/>
-              <wp:positionH relativeFrom="column">
-                <wp:posOffset>2611120</wp:posOffset>
+              <wp:positionH relativeFrom="margin">
+                <wp:posOffset>2594289</wp:posOffset>
               </wp:positionH>
               <wp:positionV relativeFrom="paragraph">
-                <wp:posOffset>10795</wp:posOffset>
+                <wp:posOffset>13970</wp:posOffset>
               </wp:positionV>
-              <wp:extent cx="204470" cy="236220"/>
+              <wp:extent cx="219291" cy="253342"/>
               <wp:effectExtent l="0" t="0" r="0" b="0"/>
               <wp:wrapNone/>
               <wp:docPr id="23" name="Imagen 2"/>
@@ -7151,7 +7207,7 @@
                     <pic:spPr bwMode="auto">
                       <a:xfrm flipH="1">
                         <a:off x="0" y="0"/>
-                        <a:ext cx="204470" cy="236220"/>
+                        <a:ext cx="219291" cy="253342"/>
                       </a:xfrm>
                       <a:prstGeom prst="rect">
                         <a:avLst/>
@@ -7161,6 +7217,12 @@
                   </pic:pic>
                 </a:graphicData>
               </a:graphic>
+              <wp14:sizeRelH relativeFrom="margin">
+                <wp14:pctWidth>0</wp14:pctWidth>
+              </wp14:sizeRelH>
+              <wp14:sizeRelV relativeFrom="margin">
+                <wp14:pctHeight>0</wp14:pctHeight>
+              </wp14:sizeRelV>
             </wp:anchor>
           </w:drawing>
         </w:r>
@@ -7179,13 +7241,16 @@
         <w:r>
           <w:fldChar w:fldCharType="end"/>
         </w:r>
-      </w:p>
-    </w:sdtContent>
-  </w:sdt>
+      </w:sdtContent>
+    </w:sdt>
+    <w:r>
+      <w:tab/>
+    </w:r>
+  </w:p>
 </w:ftr>
 </file>
 
-<file path=word/footer4.xml><?xml version="1.0" encoding="utf-8"?>
+<file path=word/footer6.xml><?xml version="1.0" encoding="utf-8"?>
 <w:ftr xmlns:wpc="http://schemas.microsoft.com/office/word/2010/wordprocessingCanvas" xmlns:cx="http://schemas.microsoft.com/office/drawing/2014/chartex" xmlns:cx1="http://schemas.microsoft.com/office/drawing/2015/9/8/chartex" xmlns:cx2="http://schemas.microsoft.com/office/drawing/2015/10/21/chartex" xmlns:cx3="http://schemas.microsoft.com/office/drawing/2016/5/9/chartex" xmlns:cx4="http://schemas.microsoft.com/office/drawing/2016/5/10/chartex" xmlns:cx5="http://schemas.microsoft.com/office/drawing/2016/5/11/chartex" xmlns:cx6="http://schemas.microsoft.com/office/drawing/2016/5/12/chartex" xmlns:cx7="http://schemas.microsoft.com/office/drawing/2016/5/13/chartex" xmlns:cx8="http://schemas.microsoft.com/office/drawing/2016/5/14/chartex" xmlns:mc="http://schemas.openxmlformats.org/markup-compatibility/2006" xmlns:aink="http://schemas.microsoft.com/office/drawing/2016/ink" xmlns:am3d="http://schemas.microsoft.com/office/drawing/2017/model3d" xmlns:o="urn:schemas-microsoft-com:office:office" xmlns:oel="http://schemas.microsoft.com/office/2019/extlst" xmlns:r="http://schemas.openxmlformats.org/officeDocument/2006/relationships" xmlns:m="http://schemas.openxmlformats.org/officeDocument/2006/math" xmlns:v="urn:schemas-microsoft-com:vml" xmlns:wp14="http://schemas.microsoft.com/office/word/2010/wordprocessingDrawing" xmlns:wp="http://schemas.openxmlformats.org/drawingml/2006/wordprocessingDrawing" xmlns:w10="urn:schemas-microsoft-com:office:word" xmlns:w="http://schemas.openxmlformats.org/wordprocessingml/2006/main" xmlns:w14="http://schemas.microsoft.com/office/word/2010/wordml" xmlns:w15="http://schemas.microsoft.com/office/word/2012/wordml" xmlns:w16cex="http://schemas.microsoft.com/office/word/2018/wordml/cex" xmlns:w16cid="http://schemas.microsoft.com/office/word/2016/wordml/cid" xmlns:w16="http://schemas.microsoft.com/office/word/2018/wordml" xmlns:w16du="http://schemas.microsoft.com/office/word/2023/wordml/word16du" xmlns:w16sdtdh="http://schemas.microsoft.com/office/word/2020/wordml/sdtdatahash" xmlns:w16sdtfl="http://schemas.microsoft.com/office/word/2024/wordml/sdtformatlock" xmlns:w16se="http://schemas.microsoft.com/office/word/2015/wordml/symex" xmlns:wpg="http://schemas.microsoft.com/office/word/2010/wordprocessingGroup" xmlns:wpi="http://schemas.microsoft.com/office/word/2010/wordprocessingInk" xmlns:wne="http://schemas.microsoft.com/office/word/2006/wordml" xmlns:wps="http://schemas.microsoft.com/office/word/2010/wordprocessingShape" mc:Ignorable="w14 w15 w16se w16cid w16 w16cex w16sdtdh w16sdtfl w16du wp14">
   <w:sdt>
     <w:sdtPr>
@@ -7299,6 +7364,16 @@
 </file>
 
 <file path=word/header1.xml><?xml version="1.0" encoding="utf-8"?>
+<w:hdr xmlns:wpc="http://schemas.microsoft.com/office/word/2010/wordprocessingCanvas" xmlns:cx="http://schemas.microsoft.com/office/drawing/2014/chartex" xmlns:cx1="http://schemas.microsoft.com/office/drawing/2015/9/8/chartex" xmlns:cx2="http://schemas.microsoft.com/office/drawing/2015/10/21/chartex" xmlns:cx3="http://schemas.microsoft.com/office/drawing/2016/5/9/chartex" xmlns:cx4="http://schemas.microsoft.com/office/drawing/2016/5/10/chartex" xmlns:cx5="http://schemas.microsoft.com/office/drawing/2016/5/11/chartex" xmlns:cx6="http://schemas.microsoft.com/office/drawing/2016/5/12/chartex" xmlns:cx7="http://schemas.microsoft.com/office/drawing/2016/5/13/chartex" xmlns:cx8="http://schemas.microsoft.com/office/drawing/2016/5/14/chartex" xmlns:mc="http://schemas.openxmlformats.org/markup-compatibility/2006" xmlns:aink="http://schemas.microsoft.com/office/drawing/2016/ink" xmlns:am3d="http://schemas.microsoft.com/office/drawing/2017/model3d" xmlns:o="urn:schemas-microsoft-com:office:office" xmlns:oel="http://schemas.microsoft.com/office/2019/extlst" xmlns:r="http://schemas.openxmlformats.org/officeDocument/2006/relationships" xmlns:m="http://schemas.openxmlformats.org/officeDocument/2006/math" xmlns:v="urn:schemas-microsoft-com:vml" xmlns:wp14="http://schemas.microsoft.com/office/word/2010/wordprocessingDrawing" xmlns:wp="http://schemas.openxmlformats.org/drawingml/2006/wordprocessingDrawing" xmlns:w10="urn:schemas-microsoft-com:office:word" xmlns:w="http://schemas.openxmlformats.org/wordprocessingml/2006/main" xmlns:w14="http://schemas.microsoft.com/office/word/2010/wordml" xmlns:w15="http://schemas.microsoft.com/office/word/2012/wordml" xmlns:w16cex="http://schemas.microsoft.com/office/word/2018/wordml/cex" xmlns:w16cid="http://schemas.microsoft.com/office/word/2016/wordml/cid" xmlns:w16="http://schemas.microsoft.com/office/word/2018/wordml" xmlns:w16du="http://schemas.microsoft.com/office/word/2023/wordml/word16du" xmlns:w16sdtdh="http://schemas.microsoft.com/office/word/2020/wordml/sdtdatahash" xmlns:w16sdtfl="http://schemas.microsoft.com/office/word/2024/wordml/sdtformatlock" xmlns:w16se="http://schemas.microsoft.com/office/word/2015/wordml/symex" xmlns:wpg="http://schemas.microsoft.com/office/word/2010/wordprocessingGroup" xmlns:wpi="http://schemas.microsoft.com/office/word/2010/wordprocessingInk" xmlns:wne="http://schemas.microsoft.com/office/word/2006/wordml" xmlns:wps="http://schemas.microsoft.com/office/word/2010/wordprocessingShape" mc:Ignorable="w14 w15 w16se w16cid w16 w16cex w16sdtdh w16sdtfl w16du wp14">
+  <w:p>
+    <w:pPr>
+      <w:pStyle w:val="Encabezado"/>
+    </w:pPr>
+  </w:p>
+</w:hdr>
+</file>
+
+<file path=word/header2.xml><?xml version="1.0" encoding="utf-8"?>
 <w:hdr xmlns:wpc="http://schemas.microsoft.com/office/word/2010/wordprocessingCanvas" xmlns:cx="http://schemas.microsoft.com/office/drawing/2014/chartex" xmlns:cx1="http://schemas.microsoft.com/office/drawing/2015/9/8/chartex" xmlns:cx2="http://schemas.microsoft.com/office/drawing/2015/10/21/chartex" xmlns:cx3="http://schemas.microsoft.com/office/drawing/2016/5/9/chartex" xmlns:cx4="http://schemas.microsoft.com/office/drawing/2016/5/10/chartex" xmlns:cx5="http://schemas.microsoft.com/office/drawing/2016/5/11/chartex" xmlns:cx6="http://schemas.microsoft.com/office/drawing/2016/5/12/chartex" xmlns:cx7="http://schemas.microsoft.com/office/drawing/2016/5/13/chartex" xmlns:cx8="http://schemas.microsoft.com/office/drawing/2016/5/14/chartex" xmlns:mc="http://schemas.openxmlformats.org/markup-compatibility/2006" xmlns:aink="http://schemas.microsoft.com/office/drawing/2016/ink" xmlns:am3d="http://schemas.microsoft.com/office/drawing/2017/model3d" xmlns:o="urn:schemas-microsoft-com:office:office" xmlns:oel="http://schemas.microsoft.com/office/2019/extlst" xmlns:r="http://schemas.openxmlformats.org/officeDocument/2006/relationships" xmlns:m="http://schemas.openxmlformats.org/officeDocument/2006/math" xmlns:v="urn:schemas-microsoft-com:vml" xmlns:wp14="http://schemas.microsoft.com/office/word/2010/wordprocessingDrawing" xmlns:wp="http://schemas.openxmlformats.org/drawingml/2006/wordprocessingDrawing" xmlns:w10="urn:schemas-microsoft-com:office:word" xmlns:w="http://schemas.openxmlformats.org/wordprocessingml/2006/main" xmlns:w14="http://schemas.microsoft.com/office/word/2010/wordml" xmlns:w15="http://schemas.microsoft.com/office/word/2012/wordml" xmlns:w16cex="http://schemas.microsoft.com/office/word/2018/wordml/cex" xmlns:w16cid="http://schemas.microsoft.com/office/word/2016/wordml/cid" xmlns:w16="http://schemas.microsoft.com/office/word/2018/wordml" xmlns:w16du="http://schemas.microsoft.com/office/word/2023/wordml/word16du" xmlns:w16sdtdh="http://schemas.microsoft.com/office/word/2020/wordml/sdtdatahash" xmlns:w16sdtfl="http://schemas.microsoft.com/office/word/2024/wordml/sdtformatlock" xmlns:w16se="http://schemas.microsoft.com/office/word/2015/wordml/symex" xmlns:wpg="http://schemas.microsoft.com/office/word/2010/wordprocessingGroup" xmlns:wpi="http://schemas.microsoft.com/office/word/2010/wordprocessingInk" xmlns:wne="http://schemas.microsoft.com/office/word/2006/wordml" xmlns:wps="http://schemas.microsoft.com/office/word/2010/wordprocessingShape" mc:Ignorable="w14 w15 w16se w16cid w16 w16cex w16sdtdh w16sdtfl w16du wp14">
   <w:p>
     <w:pPr>
@@ -8333,7 +8408,7 @@
 </w:hdr>
 </file>
 
-<file path=word/header2.xml><?xml version="1.0" encoding="utf-8"?>
+<file path=word/header3.xml><?xml version="1.0" encoding="utf-8"?>
 <w:hdr xmlns:wpc="http://schemas.microsoft.com/office/word/2010/wordprocessingCanvas" xmlns:cx="http://schemas.microsoft.com/office/drawing/2014/chartex" xmlns:cx1="http://schemas.microsoft.com/office/drawing/2015/9/8/chartex" xmlns:cx2="http://schemas.microsoft.com/office/drawing/2015/10/21/chartex" xmlns:cx3="http://schemas.microsoft.com/office/drawing/2016/5/9/chartex" xmlns:cx4="http://schemas.microsoft.com/office/drawing/2016/5/10/chartex" xmlns:cx5="http://schemas.microsoft.com/office/drawing/2016/5/11/chartex" xmlns:cx6="http://schemas.microsoft.com/office/drawing/2016/5/12/chartex" xmlns:cx7="http://schemas.microsoft.com/office/drawing/2016/5/13/chartex" xmlns:cx8="http://schemas.microsoft.com/office/drawing/2016/5/14/chartex" xmlns:mc="http://schemas.openxmlformats.org/markup-compatibility/2006" xmlns:aink="http://schemas.microsoft.com/office/drawing/2016/ink" xmlns:am3d="http://schemas.microsoft.com/office/drawing/2017/model3d" xmlns:o="urn:schemas-microsoft-com:office:office" xmlns:oel="http://schemas.microsoft.com/office/2019/extlst" xmlns:r="http://schemas.openxmlformats.org/officeDocument/2006/relationships" xmlns:m="http://schemas.openxmlformats.org/officeDocument/2006/math" xmlns:v="urn:schemas-microsoft-com:vml" xmlns:wp14="http://schemas.microsoft.com/office/word/2010/wordprocessingDrawing" xmlns:wp="http://schemas.openxmlformats.org/drawingml/2006/wordprocessingDrawing" xmlns:w10="urn:schemas-microsoft-com:office:word" xmlns:w="http://schemas.openxmlformats.org/wordprocessingml/2006/main" xmlns:w14="http://schemas.microsoft.com/office/word/2010/wordml" xmlns:w15="http://schemas.microsoft.com/office/word/2012/wordml" xmlns:w16cex="http://schemas.microsoft.com/office/word/2018/wordml/cex" xmlns:w16cid="http://schemas.microsoft.com/office/word/2016/wordml/cid" xmlns:w16="http://schemas.microsoft.com/office/word/2018/wordml" xmlns:w16du="http://schemas.microsoft.com/office/word/2023/wordml/word16du" xmlns:w16sdtdh="http://schemas.microsoft.com/office/word/2020/wordml/sdtdatahash" xmlns:w16sdtfl="http://schemas.microsoft.com/office/word/2024/wordml/sdtformatlock" xmlns:w16se="http://schemas.microsoft.com/office/word/2015/wordml/symex" xmlns:wpg="http://schemas.microsoft.com/office/word/2010/wordprocessingGroup" xmlns:wpi="http://schemas.microsoft.com/office/word/2010/wordprocessingInk" xmlns:wne="http://schemas.microsoft.com/office/word/2006/wordml" xmlns:wps="http://schemas.microsoft.com/office/word/2010/wordprocessingShape" mc:Ignorable="w14 w15 w16se w16cid w16 w16cex w16sdtdh w16sdtfl w16du wp14">
   <w:tbl>
     <w:tblPr>
@@ -8622,7 +8697,7 @@
 </w:hdr>
 </file>
 
-<file path=word/header3.xml><?xml version="1.0" encoding="utf-8"?>
+<file path=word/header4.xml><?xml version="1.0" encoding="utf-8"?>
 <w:hdr xmlns:wpc="http://schemas.microsoft.com/office/word/2010/wordprocessingCanvas" xmlns:cx="http://schemas.microsoft.com/office/drawing/2014/chartex" xmlns:cx1="http://schemas.microsoft.com/office/drawing/2015/9/8/chartex" xmlns:cx2="http://schemas.microsoft.com/office/drawing/2015/10/21/chartex" xmlns:cx3="http://schemas.microsoft.com/office/drawing/2016/5/9/chartex" xmlns:cx4="http://schemas.microsoft.com/office/drawing/2016/5/10/chartex" xmlns:cx5="http://schemas.microsoft.com/office/drawing/2016/5/11/chartex" xmlns:cx6="http://schemas.microsoft.com/office/drawing/2016/5/12/chartex" xmlns:cx7="http://schemas.microsoft.com/office/drawing/2016/5/13/chartex" xmlns:cx8="http://schemas.microsoft.com/office/drawing/2016/5/14/chartex" xmlns:mc="http://schemas.openxmlformats.org/markup-compatibility/2006" xmlns:aink="http://schemas.microsoft.com/office/drawing/2016/ink" xmlns:am3d="http://schemas.microsoft.com/office/drawing/2017/model3d" xmlns:o="urn:schemas-microsoft-com:office:office" xmlns:oel="http://schemas.microsoft.com/office/2019/extlst" xmlns:r="http://schemas.openxmlformats.org/officeDocument/2006/relationships" xmlns:m="http://schemas.openxmlformats.org/officeDocument/2006/math" xmlns:v="urn:schemas-microsoft-com:vml" xmlns:wp14="http://schemas.microsoft.com/office/word/2010/wordprocessingDrawing" xmlns:wp="http://schemas.openxmlformats.org/drawingml/2006/wordprocessingDrawing" xmlns:w10="urn:schemas-microsoft-com:office:word" xmlns:w="http://schemas.openxmlformats.org/wordprocessingml/2006/main" xmlns:w14="http://schemas.microsoft.com/office/word/2010/wordml" xmlns:w15="http://schemas.microsoft.com/office/word/2012/wordml" xmlns:w16cex="http://schemas.microsoft.com/office/word/2018/wordml/cex" xmlns:w16cid="http://schemas.microsoft.com/office/word/2016/wordml/cid" xmlns:w16="http://schemas.microsoft.com/office/word/2018/wordml" xmlns:w16du="http://schemas.microsoft.com/office/word/2023/wordml/word16du" xmlns:w16sdtdh="http://schemas.microsoft.com/office/word/2020/wordml/sdtdatahash" xmlns:w16sdtfl="http://schemas.microsoft.com/office/word/2024/wordml/sdtformatlock" xmlns:w16se="http://schemas.microsoft.com/office/word/2015/wordml/symex" xmlns:wpg="http://schemas.microsoft.com/office/word/2010/wordprocessingGroup" xmlns:wpi="http://schemas.microsoft.com/office/word/2010/wordprocessingInk" xmlns:wne="http://schemas.microsoft.com/office/word/2006/wordml" xmlns:wps="http://schemas.microsoft.com/office/word/2010/wordprocessingShape" mc:Ignorable="w14 w15 w16se w16cid w16 w16cex w16sdtdh w16sdtfl w16du wp14">
   <w:p>
     <w:pPr>
@@ -8632,7 +8707,7 @@
 </w:hdr>
 </file>
 
-<file path=word/header4.xml><?xml version="1.0" encoding="utf-8"?>
+<file path=word/header5.xml><?xml version="1.0" encoding="utf-8"?>
 <w:hdr xmlns:wpc="http://schemas.microsoft.com/office/word/2010/wordprocessingCanvas" xmlns:cx="http://schemas.microsoft.com/office/drawing/2014/chartex" xmlns:cx1="http://schemas.microsoft.com/office/drawing/2015/9/8/chartex" xmlns:cx2="http://schemas.microsoft.com/office/drawing/2015/10/21/chartex" xmlns:cx3="http://schemas.microsoft.com/office/drawing/2016/5/9/chartex" xmlns:cx4="http://schemas.microsoft.com/office/drawing/2016/5/10/chartex" xmlns:cx5="http://schemas.microsoft.com/office/drawing/2016/5/11/chartex" xmlns:cx6="http://schemas.microsoft.com/office/drawing/2016/5/12/chartex" xmlns:cx7="http://schemas.microsoft.com/office/drawing/2016/5/13/chartex" xmlns:cx8="http://schemas.microsoft.com/office/drawing/2016/5/14/chartex" xmlns:mc="http://schemas.openxmlformats.org/markup-compatibility/2006" xmlns:aink="http://schemas.microsoft.com/office/drawing/2016/ink" xmlns:am3d="http://schemas.microsoft.com/office/drawing/2017/model3d" xmlns:o="urn:schemas-microsoft-com:office:office" xmlns:oel="http://schemas.microsoft.com/office/2019/extlst" xmlns:r="http://schemas.openxmlformats.org/officeDocument/2006/relationships" xmlns:m="http://schemas.openxmlformats.org/officeDocument/2006/math" xmlns:v="urn:schemas-microsoft-com:vml" xmlns:wp14="http://schemas.microsoft.com/office/word/2010/wordprocessingDrawing" xmlns:wp="http://schemas.openxmlformats.org/drawingml/2006/wordprocessingDrawing" xmlns:w10="urn:schemas-microsoft-com:office:word" xmlns:w="http://schemas.openxmlformats.org/wordprocessingml/2006/main" xmlns:w14="http://schemas.microsoft.com/office/word/2010/wordml" xmlns:w15="http://schemas.microsoft.com/office/word/2012/wordml" xmlns:w16cex="http://schemas.microsoft.com/office/word/2018/wordml/cex" xmlns:w16cid="http://schemas.microsoft.com/office/word/2016/wordml/cid" xmlns:w16="http://schemas.microsoft.com/office/word/2018/wordml" xmlns:w16du="http://schemas.microsoft.com/office/word/2023/wordml/word16du" xmlns:w16sdtdh="http://schemas.microsoft.com/office/word/2020/wordml/sdtdatahash" xmlns:w16sdtfl="http://schemas.microsoft.com/office/word/2024/wordml/sdtformatlock" xmlns:w16se="http://schemas.microsoft.com/office/word/2015/wordml/symex" xmlns:wpg="http://schemas.microsoft.com/office/word/2010/wordprocessingGroup" xmlns:wpi="http://schemas.microsoft.com/office/word/2010/wordprocessingInk" xmlns:wne="http://schemas.microsoft.com/office/word/2006/wordml" xmlns:wps="http://schemas.microsoft.com/office/word/2010/wordprocessingShape" mc:Ignorable="w14 w15 w16se w16cid w16 w16cex w16sdtdh w16sdtfl w16du wp14">
   <w:p>
     <w:pPr>
@@ -9542,7 +9617,7 @@
 </w:hdr>
 </file>
 
-<file path=word/header5.xml><?xml version="1.0" encoding="utf-8"?>
+<file path=word/header6.xml><?xml version="1.0" encoding="utf-8"?>
 <w:hdr xmlns:wpc="http://schemas.microsoft.com/office/word/2010/wordprocessingCanvas" xmlns:cx="http://schemas.microsoft.com/office/drawing/2014/chartex" xmlns:cx1="http://schemas.microsoft.com/office/drawing/2015/9/8/chartex" xmlns:cx2="http://schemas.microsoft.com/office/drawing/2015/10/21/chartex" xmlns:cx3="http://schemas.microsoft.com/office/drawing/2016/5/9/chartex" xmlns:cx4="http://schemas.microsoft.com/office/drawing/2016/5/10/chartex" xmlns:cx5="http://schemas.microsoft.com/office/drawing/2016/5/11/chartex" xmlns:cx6="http://schemas.microsoft.com/office/drawing/2016/5/12/chartex" xmlns:cx7="http://schemas.microsoft.com/office/drawing/2016/5/13/chartex" xmlns:cx8="http://schemas.microsoft.com/office/drawing/2016/5/14/chartex" xmlns:mc="http://schemas.openxmlformats.org/markup-compatibility/2006" xmlns:aink="http://schemas.microsoft.com/office/drawing/2016/ink" xmlns:am3d="http://schemas.microsoft.com/office/drawing/2017/model3d" xmlns:o="urn:schemas-microsoft-com:office:office" xmlns:oel="http://schemas.microsoft.com/office/2019/extlst" xmlns:r="http://schemas.openxmlformats.org/officeDocument/2006/relationships" xmlns:m="http://schemas.openxmlformats.org/officeDocument/2006/math" xmlns:v="urn:schemas-microsoft-com:vml" xmlns:wp14="http://schemas.microsoft.com/office/word/2010/wordprocessingDrawing" xmlns:wp="http://schemas.openxmlformats.org/drawingml/2006/wordprocessingDrawing" xmlns:w10="urn:schemas-microsoft-com:office:word" xmlns:w="http://schemas.openxmlformats.org/wordprocessingml/2006/main" xmlns:w14="http://schemas.microsoft.com/office/word/2010/wordml" xmlns:w15="http://schemas.microsoft.com/office/word/2012/wordml" xmlns:w16cex="http://schemas.microsoft.com/office/word/2018/wordml/cex" xmlns:w16cid="http://schemas.microsoft.com/office/word/2016/wordml/cid" xmlns:w16="http://schemas.microsoft.com/office/word/2018/wordml" xmlns:w16du="http://schemas.microsoft.com/office/word/2023/wordml/word16du" xmlns:w16sdtdh="http://schemas.microsoft.com/office/word/2020/wordml/sdtdatahash" xmlns:w16sdtfl="http://schemas.microsoft.com/office/word/2024/wordml/sdtformatlock" xmlns:w16se="http://schemas.microsoft.com/office/word/2015/wordml/symex" xmlns:wpg="http://schemas.microsoft.com/office/word/2010/wordprocessingGroup" xmlns:wpi="http://schemas.microsoft.com/office/word/2010/wordprocessingInk" xmlns:wne="http://schemas.microsoft.com/office/word/2006/wordml" xmlns:wps="http://schemas.microsoft.com/office/word/2010/wordprocessingShape" mc:Ignorable="w14 w15 w16se w16cid w16 w16cex w16sdtdh w16sdtfl w16du wp14">
   <w:tbl>
     <w:tblPr>
@@ -12869,6 +12944,7 @@
   <w:style w:type="character" w:default="1" w:styleId="Fuentedeprrafopredeter">
     <w:name w:val="Default Paragraph Font"/>
     <w:uiPriority w:val="1"/>
+    <w:semiHidden/>
     <w:unhideWhenUsed/>
   </w:style>
   <w:style w:type="table" w:default="1" w:styleId="Tablanormal">

</xml_diff>

<commit_message>
subida memoria en pdf
</commit_message>
<xml_diff>
--- a/docs/Proyecto_RuteX_GO.docx
+++ b/docs/Proyecto_RuteX_GO.docx
@@ -504,7 +504,7 @@
                 <w:noProof/>
                 <w:webHidden/>
               </w:rPr>
-              <w:t>7</w:t>
+              <w:t>6</w:t>
             </w:r>
             <w:r>
               <w:rPr>
@@ -590,7 +590,7 @@
                 <w:noProof/>
                 <w:webHidden/>
               </w:rPr>
-              <w:t>9</w:t>
+              <w:t>8</w:t>
             </w:r>
             <w:r>
               <w:rPr>
@@ -676,7 +676,7 @@
                 <w:noProof/>
                 <w:webHidden/>
               </w:rPr>
-              <w:t>9</w:t>
+              <w:t>8</w:t>
             </w:r>
             <w:r>
               <w:rPr>
@@ -762,7 +762,7 @@
                 <w:noProof/>
                 <w:webHidden/>
               </w:rPr>
-              <w:t>10</w:t>
+              <w:t>9</w:t>
             </w:r>
             <w:r>
               <w:rPr>
@@ -848,7 +848,7 @@
                 <w:noProof/>
                 <w:webHidden/>
               </w:rPr>
-              <w:t>10</w:t>
+              <w:t>9</w:t>
             </w:r>
             <w:r>
               <w:rPr>
@@ -934,7 +934,7 @@
                 <w:noProof/>
                 <w:webHidden/>
               </w:rPr>
-              <w:t>10</w:t>
+              <w:t>9</w:t>
             </w:r>
             <w:r>
               <w:rPr>
@@ -1020,7 +1020,7 @@
                 <w:noProof/>
                 <w:webHidden/>
               </w:rPr>
-              <w:t>12</w:t>
+              <w:t>11</w:t>
             </w:r>
             <w:r>
               <w:rPr>
@@ -1106,7 +1106,7 @@
                 <w:noProof/>
                 <w:webHidden/>
               </w:rPr>
-              <w:t>12</w:t>
+              <w:t>11</w:t>
             </w:r>
             <w:r>
               <w:rPr>
@@ -1200,7 +1200,7 @@
                 <w:noProof/>
                 <w:webHidden/>
               </w:rPr>
-              <w:t>13</w:t>
+              <w:t>12</w:t>
             </w:r>
             <w:r>
               <w:rPr>
@@ -1286,7 +1286,7 @@
                 <w:noProof/>
                 <w:webHidden/>
               </w:rPr>
-              <w:t>15</w:t>
+              <w:t>14</w:t>
             </w:r>
             <w:r>
               <w:rPr>
@@ -1372,7 +1372,7 @@
                 <w:noProof/>
                 <w:webHidden/>
               </w:rPr>
-              <w:t>15</w:t>
+              <w:t>14</w:t>
             </w:r>
             <w:r>
               <w:rPr>
@@ -1458,7 +1458,7 @@
                 <w:noProof/>
                 <w:webHidden/>
               </w:rPr>
-              <w:t>15</w:t>
+              <w:t>14</w:t>
             </w:r>
             <w:r>
               <w:rPr>
@@ -1544,7 +1544,7 @@
                 <w:noProof/>
                 <w:webHidden/>
               </w:rPr>
-              <w:t>15</w:t>
+              <w:t>14</w:t>
             </w:r>
             <w:r>
               <w:rPr>
@@ -1630,7 +1630,7 @@
                 <w:noProof/>
                 <w:webHidden/>
               </w:rPr>
-              <w:t>15</w:t>
+              <w:t>14</w:t>
             </w:r>
             <w:r>
               <w:rPr>
@@ -1716,7 +1716,7 @@
                 <w:noProof/>
                 <w:webHidden/>
               </w:rPr>
-              <w:t>15</w:t>
+              <w:t>14</w:t>
             </w:r>
             <w:r>
               <w:rPr>
@@ -1802,7 +1802,7 @@
                 <w:noProof/>
                 <w:webHidden/>
               </w:rPr>
-              <w:t>16</w:t>
+              <w:t>15</w:t>
             </w:r>
             <w:r>
               <w:rPr>
@@ -1888,7 +1888,7 @@
                 <w:noProof/>
                 <w:webHidden/>
               </w:rPr>
-              <w:t>16</w:t>
+              <w:t>15</w:t>
             </w:r>
             <w:r>
               <w:rPr>
@@ -4520,16 +4520,7 @@
             <w:b/>
             <w:bCs/>
           </w:rPr>
-          <w:t xml:space="preserve">: </w:t>
-        </w:r>
-        <w:r>
-          <w:rPr>
-            <w:rStyle w:val="Hipervnculo"/>
-            <w:rFonts w:ascii="Arial" w:hAnsi="Arial" w:cs="Arial"/>
-            <w:b/>
-            <w:bCs/>
-          </w:rPr>
-          <w:t>Autenticación completa (</w:t>
+          <w:t>: Autenticación completa (</w:t>
         </w:r>
         <w:proofErr w:type="spellStart"/>
         <w:r>
@@ -4606,25 +4597,7 @@
             <w:b/>
             <w:bCs/>
           </w:rPr>
-          <w:t>Registro de usuario co</w:t>
-        </w:r>
-        <w:r>
-          <w:rPr>
-            <w:rStyle w:val="Hipervnculo"/>
-            <w:rFonts w:ascii="Arial" w:hAnsi="Arial" w:cs="Arial"/>
-            <w:b/>
-            <w:bCs/>
-          </w:rPr>
-          <w:t>m</w:t>
-        </w:r>
-        <w:r>
-          <w:rPr>
-            <w:rStyle w:val="Hipervnculo"/>
-            <w:rFonts w:ascii="Arial" w:hAnsi="Arial" w:cs="Arial"/>
-            <w:b/>
-            <w:bCs/>
-          </w:rPr>
-          <w:t>pleto</w:t>
+          <w:t>Registro de usuario completo</w:t>
         </w:r>
       </w:hyperlink>
     </w:p>
@@ -4709,16 +4682,7 @@
             <w:b/>
             <w:bCs/>
           </w:rPr>
-          <w:t xml:space="preserve">: </w:t>
-        </w:r>
-        <w:r>
-          <w:rPr>
-            <w:rStyle w:val="Hipervnculo"/>
-            <w:rFonts w:ascii="Arial" w:hAnsi="Arial" w:cs="Arial"/>
-            <w:b/>
-            <w:bCs/>
-          </w:rPr>
-          <w:t>Selección de ciudad operativa</w:t>
+          <w:t>: Selección de ciudad operativa</w:t>
         </w:r>
       </w:hyperlink>
     </w:p>
@@ -4766,25 +4730,7 @@
             <w:b/>
             <w:bCs/>
           </w:rPr>
-          <w:t>HU-014</w:t>
-        </w:r>
-        <w:r>
-          <w:rPr>
-            <w:rStyle w:val="Hipervnculo"/>
-            <w:rFonts w:ascii="Arial" w:hAnsi="Arial" w:cs="Arial"/>
-            <w:b/>
-            <w:bCs/>
-          </w:rPr>
-          <w:t xml:space="preserve">: </w:t>
-        </w:r>
-        <w:r>
-          <w:rPr>
-            <w:rStyle w:val="Hipervnculo"/>
-            <w:rFonts w:ascii="Arial" w:hAnsi="Arial" w:cs="Arial"/>
-            <w:b/>
-            <w:bCs/>
-          </w:rPr>
-          <w:t>Navegación GPS operativa en ruta</w:t>
+          <w:t>HU-014: Navegación GPS operativa en ruta</w:t>
         </w:r>
       </w:hyperlink>
     </w:p>
@@ -4832,16 +4778,7 @@
             <w:b/>
             <w:bCs/>
           </w:rPr>
-          <w:t xml:space="preserve">HU-015: </w:t>
-        </w:r>
-        <w:r>
-          <w:rPr>
-            <w:rStyle w:val="Hipervnculo"/>
-            <w:rFonts w:ascii="Arial" w:hAnsi="Arial" w:cs="Arial"/>
-            <w:b/>
-            <w:bCs/>
-          </w:rPr>
-          <w:t>Misión (quiz) completada y validada</w:t>
+          <w:t>HU-015: Misión (quiz) completada y validada</w:t>
         </w:r>
       </w:hyperlink>
     </w:p>
@@ -5159,6 +5096,9 @@
       </w:r>
       <w:fldSimple w:instr=" SEQ Ilustración \* ARABIC ">
         <w:r>
+          <w:rPr>
+            <w:noProof/>
+          </w:rPr>
           <w:t>1</w:t>
         </w:r>
       </w:fldSimple>
@@ -5232,6 +5172,9 @@
       </w:r>
       <w:fldSimple w:instr=" SEQ Ilustración \* ARABIC ">
         <w:r>
+          <w:rPr>
+            <w:noProof/>
+          </w:rPr>
           <w:t>2</w:t>
         </w:r>
       </w:fldSimple>
@@ -5627,16 +5570,7 @@
             <w:b/>
             <w:bCs/>
           </w:rPr>
-          <w:t xml:space="preserve"> como tecnología móvil</w:t>
-        </w:r>
-        <w:r>
-          <w:rPr>
-            <w:rStyle w:val="Hipervnculo"/>
-            <w:rFonts w:ascii="Arial" w:hAnsi="Arial" w:cs="Arial"/>
-            <w:b/>
-            <w:bCs/>
-          </w:rPr>
-          <w:t>:</w:t>
+          <w:t xml:space="preserve"> como tecnología móvil:</w:t>
         </w:r>
       </w:hyperlink>
     </w:p>
@@ -5921,9 +5855,15 @@
         <w:rPr>
           <w:rFonts w:ascii="Arial" w:hAnsi="Arial" w:cs="Arial"/>
         </w:rPr>
-        <w:t>Auth:</w:t>
+        <w:t>Auth</w:t>
       </w:r>
       <w:proofErr w:type="spellEnd"/>
+      <w:r>
+        <w:rPr>
+          <w:rFonts w:ascii="Arial" w:hAnsi="Arial" w:cs="Arial"/>
+        </w:rPr>
+        <w:t>:</w:t>
+      </w:r>
     </w:p>
     <w:p>
       <w:pPr>
@@ -5979,9 +5919,15 @@
         <w:rPr>
           <w:rFonts w:ascii="Arial" w:hAnsi="Arial" w:cs="Arial"/>
         </w:rPr>
-        <w:t>Firestore.</w:t>
+        <w:t>Firestore</w:t>
       </w:r>
       <w:proofErr w:type="spellEnd"/>
+      <w:r>
+        <w:rPr>
+          <w:rFonts w:ascii="Arial" w:hAnsi="Arial" w:cs="Arial"/>
+        </w:rPr>
+        <w:t>.</w:t>
+      </w:r>
     </w:p>
     <w:p>
       <w:pPr>
@@ -6033,13 +5979,13 @@
         </w:rPr>
         <w:t>Firestore</w:t>
       </w:r>
+      <w:proofErr w:type="spellEnd"/>
       <w:r>
         <w:rPr>
           <w:rFonts w:ascii="Arial" w:hAnsi="Arial" w:cs="Arial"/>
         </w:rPr>
         <w:t>:</w:t>
       </w:r>
-      <w:proofErr w:type="spellEnd"/>
     </w:p>
     <w:p>
       <w:pPr>
@@ -6637,15 +6583,7 @@
           <w:b/>
           <w:bCs/>
         </w:rPr>
-        <w:t>T</w:t>
-      </w:r>
-      <w:r>
-        <w:rPr>
-          <w:rFonts w:ascii="Arial" w:hAnsi="Arial" w:cs="Arial"/>
-          <w:b/>
-          <w:bCs/>
-        </w:rPr>
-        <w:t>iempo de respuesta general del sistema</w:t>
+        <w:t>Tiempo de respuesta general del sistema</w:t>
       </w:r>
       <w:r>
         <w:rPr>
@@ -14466,6 +14404,7 @@
   <w:style w:type="character" w:default="1" w:styleId="Fuentedeprrafopredeter">
     <w:name w:val="Default Paragraph Font"/>
     <w:uiPriority w:val="1"/>
+    <w:semiHidden/>
     <w:unhideWhenUsed/>
   </w:style>
   <w:style w:type="table" w:default="1" w:styleId="Tablanormal">

</xml_diff>